<commit_message>
Question 10 answered: one note per project; warehouse line = credit facility, one instrument, until bond take-out at stabilization; cascaded through whitepaper (new s11), guide v0.98, INS-303 unlock, INS-006, TODO, Kill Memo pointer; rev 40
</commit_message>
<xml_diff>
--- a/02_PROGRAM/INS-002_Program_Whitepaper_v1.1.docx
+++ b/02_PROGRAM/INS-002_Program_Whitepaper_v1.1.docx
@@ -2,7 +2,7 @@
 <file path=word/document.xml><?xml version="1.0" encoding="utf-8"?>
 <w:document xmlns:w="http://schemas.openxmlformats.org/wordprocessingml/2006/main" xmlns:m="http://schemas.openxmlformats.org/officeDocument/2006/math" xmlns:r="http://schemas.openxmlformats.org/officeDocument/2006/relationships" xmlns:o="urn:schemas-microsoft-com:office:office" xmlns:v="urn:schemas-microsoft-com:vml" xmlns:w10="urn:schemas-microsoft-com:office:word" xmlns:a="http://schemas.openxmlformats.org/drawingml/2006/main" xmlns:pic="http://schemas.openxmlformats.org/drawingml/2006/picture" xmlns:wp="http://schemas.openxmlformats.org/drawingml/2006/wordprocessingDrawing">
   <w:body>
-    <w:bookmarkStart w:id="34" w:name="ins-002-program-whitepaper"/>
+    <w:bookmarkStart w:id="35" w:name="ins-002-program-whitepaper"/>
     <w:p>
       <w:pPr>
         <w:pStyle w:val="Heading1"/>
@@ -1126,13 +1126,13 @@
       </w:r>
     </w:p>
     <w:bookmarkEnd w:id="29"/>
-    <w:bookmarkStart w:id="30" w:name="program-status-and-what-comes-next"/>
+    <w:bookmarkStart w:id="30" w:name="the-financing-platform-three-altitudes"/>
     <w:p>
       <w:pPr>
         <w:pStyle w:val="Heading2"/>
       </w:pPr>
       <w:r>
-        <w:t xml:space="preserve">11. Program status and what comes next</w:t>
+        <w:t xml:space="preserve">11. The financing platform, three altitudes</w:t>
       </w:r>
     </w:p>
     <w:p>
@@ -1140,17 +1140,35 @@
         <w:pStyle w:val="FirstParagraph"/>
       </w:pPr>
       <w:r>
+        <w:t xml:space="preserve">Confirmed in the founder’s structure on July 13, 2026: the program is one pipeline viewed at three altitudes. At origination, each project’s annexation carries its own privately placed, tax-secured note, sized to that project alone and secured only by that project’s special taxes, with no cross-collateralization. One revolving warehouse credit facility, and it is one instrument, the warehouse line and the credit facility being the same thing, funds every origination as projects are approved: draw request, funding approval, advance, payment of eligible costs, repayment through the annual special taxes. And pooled tax-exempt bonds stand as the optional permanent take-out once the portfolio of properties has stabilized. The take-out is never required for the program to operate; annexations continue regardless of what the capital stack above them does. This is the same architecture at which the statewide programs arrived by a different road: local obligations, one per project, pooled upward into program-level financing.</w:t>
+      </w:r>
+    </w:p>
+    <w:bookmarkEnd w:id="30"/>
+    <w:bookmarkStart w:id="31" w:name="program-status-and-what-comes-next"/>
+    <w:p>
+      <w:pPr>
+        <w:pStyle w:val="Heading2"/>
+      </w:pPr>
+      <w:r>
+        <w:t xml:space="preserve">12. Program status and what comes next</w:t>
+      </w:r>
+    </w:p>
+    <w:p>
+      <w:pPr>
+        <w:pStyle w:val="FirstParagraph"/>
+      </w:pPr>
+      <w:r>
         <w:t xml:space="preserve">Proven today: the legal mechanism, the annexation architecture in live districts, the market arithmetic from primary data, and a documented operating library (appraisal manual, request-for-qualifications, data package standards, structure map, and the strategy memos INS-003 through INS-005). Pending: consultant and counsel selection, issuer adoption, a signed term sheet, and the pilot closing. This paper is versioned; version 1.1 brackets those blanks as explicit placeholders, and version 1.2 follows the engagements themselves.</w:t>
       </w:r>
     </w:p>
-    <w:bookmarkEnd w:id="30"/>
-    <w:bookmarkStart w:id="31" w:name="sources"/>
+    <w:bookmarkEnd w:id="31"/>
+    <w:bookmarkStart w:id="32" w:name="sources"/>
     <w:p>
       <w:pPr>
         <w:pStyle w:val="Heading2"/>
       </w:pPr>
       <w:r>
-        <w:t xml:space="preserve">12. Sources</w:t>
+        <w:t xml:space="preserve">13. Sources</w:t>
       </w:r>
     </w:p>
     <w:p>
@@ -1321,8 +1339,8 @@
         <w:t xml:space="preserve">Administrative cost recovery (section 53317(d)): https://specialdistricttransparency.com/wp-content/uploads/2025/01/TVUSD-CFD-2021.1-SB165-Report-FY23.24-Final.pdf</w:t>
       </w:r>
     </w:p>
-    <w:bookmarkEnd w:id="31"/>
-    <w:bookmarkStart w:id="32" w:name="named-roles-as-of-this-version"/>
+    <w:bookmarkEnd w:id="32"/>
+    <w:bookmarkStart w:id="33" w:name="named-roles-as-of-this-version"/>
     <w:p>
       <w:pPr>
         <w:pStyle w:val="Heading2"/>
@@ -1407,8 +1425,8 @@
         <w:t xml:space="preserve">HGF Management Company, Dennis Lanni, Founder, insite-ca.org.</w:t>
       </w:r>
     </w:p>
-    <w:bookmarkEnd w:id="32"/>
-    <w:bookmarkStart w:id="33" w:name="change-log"/>
+    <w:bookmarkEnd w:id="33"/>
+    <w:bookmarkStart w:id="34" w:name="change-log"/>
     <w:p>
       <w:pPr>
         <w:pStyle w:val="Heading2"/>
@@ -1437,8 +1455,8 @@
         <w:t xml:space="preserve">INSITE(TM) is a pre-launch program concept administered by HGF Management Company. Pre-launch draft v1.1, placeholder edition. This is not an offer of financing, legal advice, or investment advice. Program structure is subject to issuer approval and bond counsel review.</w:t>
       </w:r>
     </w:p>
-    <w:bookmarkEnd w:id="33"/>
     <w:bookmarkEnd w:id="34"/>
+    <w:bookmarkEnd w:id="35"/>
     <w:sectPr/>
   </w:body>
 </w:document>

</xml_diff>